<commit_message>
Motivational Poster: font-name note + reflection covers full process
Overview font note now tells students the font choice matters and they must
list the exact font name in their reflection. The reflection document is
expanded to six questions covering the whole process: subject + quote, exact
font name, building the PRINT poster, building the MOBILE wallpaper, hardest
part, and pride/enjoyment (plus the extra-credit logo). Step 03 copy updated.

Co-Authored-By: Claude Opus 4.8 <noreply@anthropic.com>
</commit_message>
<xml_diff>
--- a/assets/course-documents/Motivational-Poster-Reflection-EN.docx
+++ b/assets/course-documents/Motivational-Poster-Reflection-EN.docx
@@ -206,7 +206,7 @@
                 <w:sz w:val="23"/>
                 <w:szCs w:val="23"/>
               </w:rPr>
-              <w:t xml:space="preserve">Who did you choose for your poster (a real person or a fictional character), and why do they inspire you?</w:t>
+              <w:t xml:space="preserve">Who did you choose for your poster (a real person or a fictional character), and why do they inspire you? What is the real quote you used?</w:t>
             </w:r>
           </w:p>
         </w:tc>
@@ -326,7 +326,7 @@
                 <w:sz w:val="23"/>
                 <w:szCs w:val="23"/>
               </w:rPr>
-              <w:t xml:space="preserve">What font (typeface) did you choose for your quote, and why does it fit your poster?</w:t>
+              <w:t xml:space="preserve">What is the exact name of the font (typeface) you used for your words, and why does it fit your poster?</w:t>
             </w:r>
           </w:p>
         </w:tc>
@@ -446,7 +446,7 @@
                 <w:sz w:val="23"/>
                 <w:szCs w:val="23"/>
               </w:rPr>
-              <w:t xml:space="preserve">What was the hardest part of the design?</w:t>
+              <w:t xml:space="preserve">Walk through how you made the PRINT poster: cutting your subject off their background, blurring the background, and adding your words and colors.</w:t>
             </w:r>
           </w:p>
         </w:tc>
@@ -566,7 +566,7 @@
                 <w:sz w:val="23"/>
                 <w:szCs w:val="23"/>
               </w:rPr>
-              <w:t xml:space="preserve">What did you enjoy about this project?</w:t>
+              <w:t xml:space="preserve">Walk through how you made the MOBILE wallpaper version: what did you change to fit the tall, narrow phone screen?</w:t>
             </w:r>
           </w:p>
         </w:tc>
@@ -638,6 +638,246 @@
         <w:t xml:space="preserve"/>
       </w:r>
     </w:p>
+    <w:tbl>
+      <w:tblPr>
+        <w:tblW w:type="dxa" w:w="10800"/>
+        <w:tblBorders>
+          <w:top w:val="none"/>
+          <w:left w:val="none"/>
+          <w:bottom w:val="none"/>
+          <w:right w:val="none"/>
+          <w:insideH w:val="single" w:color="auto" w:sz="4"/>
+          <w:insideV w:val="single" w:color="auto" w:sz="4"/>
+        </w:tblBorders>
+      </w:tblPr>
+      <w:tblGrid>
+        <w:gridCol w:w="10800"/>
+      </w:tblGrid>
+      <w:tr>
+        <w:tc>
+          <w:tcPr>
+            <w:tcW w:type="dxa" w:w="10800"/>
+            <w:shd w:fill="007474" w:val="clear"/>
+            <w:tcMar>
+              <w:top w:type="dxa" w:w="70"/>
+              <w:left w:type="dxa" w:w="160"/>
+              <w:bottom w:type="dxa" w:w="70"/>
+              <w:right w:type="dxa" w:w="160"/>
+            </w:tcMar>
+          </w:tcPr>
+          <w:p>
+            <w:r>
+              <w:rPr>
+                <w:rFonts w:ascii="Arial" w:cs="Arial" w:eastAsia="Arial" w:hAnsi="Arial"/>
+                <w:b/>
+                <w:bCs/>
+                <w:color w:val="FFFFFF"/>
+                <w:sz w:val="23"/>
+                <w:szCs w:val="23"/>
+              </w:rPr>
+              <w:t xml:space="preserve">5.  </w:t>
+            </w:r>
+            <w:r>
+              <w:rPr>
+                <w:rFonts w:ascii="Arial" w:cs="Arial" w:eastAsia="Arial" w:hAnsi="Arial"/>
+                <w:b/>
+                <w:bCs/>
+                <w:color w:val="FFFFFF"/>
+                <w:sz w:val="23"/>
+                <w:szCs w:val="23"/>
+              </w:rPr>
+              <w:t xml:space="preserve">What was the hardest part of the whole process, and how did you work through it?</w:t>
+            </w:r>
+          </w:p>
+        </w:tc>
+      </w:tr>
+    </w:tbl>
+    <w:p>
+      <w:pPr>
+        <w:spacing w:after="60"/>
+      </w:pPr>
+      <w:r>
+        <w:t xml:space="preserve"/>
+      </w:r>
+    </w:p>
+    <w:tbl>
+      <w:tblPr>
+        <w:tblW w:type="dxa" w:w="10800"/>
+        <w:tblBorders>
+          <w:top w:val="single" w:color="auto" w:sz="4"/>
+          <w:left w:val="single" w:color="auto" w:sz="4"/>
+          <w:bottom w:val="single" w:color="auto" w:sz="4"/>
+          <w:right w:val="single" w:color="auto" w:sz="4"/>
+          <w:insideH w:val="single" w:color="auto" w:sz="4"/>
+          <w:insideV w:val="single" w:color="auto" w:sz="4"/>
+        </w:tblBorders>
+      </w:tblPr>
+      <w:tblGrid>
+        <w:gridCol w:w="10800"/>
+      </w:tblGrid>
+      <w:tr>
+        <w:trPr>
+          <w:trHeight w:val="1500" w:hRule="atLeast"/>
+        </w:trPr>
+        <w:tc>
+          <w:tcPr>
+            <w:tcW w:type="dxa" w:w="10800"/>
+            <w:tcBorders>
+              <w:top w:val="single" w:color="C4C4C4" w:sz="8"/>
+              <w:left w:val="single" w:color="C4C4C4" w:sz="8"/>
+              <w:bottom w:val="single" w:color="C4C4C4" w:sz="8"/>
+              <w:right w:val="single" w:color="C4C4C4" w:sz="8"/>
+            </w:tcBorders>
+            <w:tcMar>
+              <w:top w:type="dxa" w:w="100"/>
+              <w:left w:type="dxa" w:w="160"/>
+              <w:bottom w:type="dxa" w:w="100"/>
+              <w:right w:type="dxa" w:w="160"/>
+            </w:tcMar>
+          </w:tcPr>
+          <w:p>
+            <w:r>
+              <w:rPr>
+                <w:i/>
+                <w:iCs/>
+                <w:color w:val="8A8A8A"/>
+                <w:sz w:val="22"/>
+                <w:szCs w:val="22"/>
+              </w:rPr>
+              <w:t xml:space="preserve">Type your answer here.</w:t>
+            </w:r>
+          </w:p>
+        </w:tc>
+      </w:tr>
+    </w:tbl>
+    <w:p>
+      <w:pPr>
+        <w:spacing w:after="160"/>
+      </w:pPr>
+      <w:r>
+        <w:t xml:space="preserve"/>
+      </w:r>
+    </w:p>
+    <w:tbl>
+      <w:tblPr>
+        <w:tblW w:type="dxa" w:w="10800"/>
+        <w:tblBorders>
+          <w:top w:val="none"/>
+          <w:left w:val="none"/>
+          <w:bottom w:val="none"/>
+          <w:right w:val="none"/>
+          <w:insideH w:val="single" w:color="auto" w:sz="4"/>
+          <w:insideV w:val="single" w:color="auto" w:sz="4"/>
+        </w:tblBorders>
+      </w:tblPr>
+      <w:tblGrid>
+        <w:gridCol w:w="10800"/>
+      </w:tblGrid>
+      <w:tr>
+        <w:tc>
+          <w:tcPr>
+            <w:tcW w:type="dxa" w:w="10800"/>
+            <w:shd w:fill="007474" w:val="clear"/>
+            <w:tcMar>
+              <w:top w:type="dxa" w:w="70"/>
+              <w:left w:type="dxa" w:w="160"/>
+              <w:bottom w:type="dxa" w:w="70"/>
+              <w:right w:type="dxa" w:w="160"/>
+            </w:tcMar>
+          </w:tcPr>
+          <w:p>
+            <w:r>
+              <w:rPr>
+                <w:rFonts w:ascii="Arial" w:cs="Arial" w:eastAsia="Arial" w:hAnsi="Arial"/>
+                <w:b/>
+                <w:bCs/>
+                <w:color w:val="FFFFFF"/>
+                <w:sz w:val="23"/>
+                <w:szCs w:val="23"/>
+              </w:rPr>
+              <w:t xml:space="preserve">6.  </w:t>
+            </w:r>
+            <w:r>
+              <w:rPr>
+                <w:rFonts w:ascii="Arial" w:cs="Arial" w:eastAsia="Arial" w:hAnsi="Arial"/>
+                <w:b/>
+                <w:bCs/>
+                <w:color w:val="FFFFFF"/>
+                <w:sz w:val="23"/>
+                <w:szCs w:val="23"/>
+              </w:rPr>
+              <w:t xml:space="preserve">What are you most proud of, and what did you enjoy most? (If you did the extra-credit logo, tell us about it.)</w:t>
+            </w:r>
+          </w:p>
+        </w:tc>
+      </w:tr>
+    </w:tbl>
+    <w:p>
+      <w:pPr>
+        <w:spacing w:after="60"/>
+      </w:pPr>
+      <w:r>
+        <w:t xml:space="preserve"/>
+      </w:r>
+    </w:p>
+    <w:tbl>
+      <w:tblPr>
+        <w:tblW w:type="dxa" w:w="10800"/>
+        <w:tblBorders>
+          <w:top w:val="single" w:color="auto" w:sz="4"/>
+          <w:left w:val="single" w:color="auto" w:sz="4"/>
+          <w:bottom w:val="single" w:color="auto" w:sz="4"/>
+          <w:right w:val="single" w:color="auto" w:sz="4"/>
+          <w:insideH w:val="single" w:color="auto" w:sz="4"/>
+          <w:insideV w:val="single" w:color="auto" w:sz="4"/>
+        </w:tblBorders>
+      </w:tblPr>
+      <w:tblGrid>
+        <w:gridCol w:w="10800"/>
+      </w:tblGrid>
+      <w:tr>
+        <w:trPr>
+          <w:trHeight w:val="1500" w:hRule="atLeast"/>
+        </w:trPr>
+        <w:tc>
+          <w:tcPr>
+            <w:tcW w:type="dxa" w:w="10800"/>
+            <w:tcBorders>
+              <w:top w:val="single" w:color="C4C4C4" w:sz="8"/>
+              <w:left w:val="single" w:color="C4C4C4" w:sz="8"/>
+              <w:bottom w:val="single" w:color="C4C4C4" w:sz="8"/>
+              <w:right w:val="single" w:color="C4C4C4" w:sz="8"/>
+            </w:tcBorders>
+            <w:tcMar>
+              <w:top w:type="dxa" w:w="100"/>
+              <w:left w:type="dxa" w:w="160"/>
+              <w:bottom w:type="dxa" w:w="100"/>
+              <w:right w:type="dxa" w:w="160"/>
+            </w:tcMar>
+          </w:tcPr>
+          <w:p>
+            <w:r>
+              <w:rPr>
+                <w:i/>
+                <w:iCs/>
+                <w:color w:val="8A8A8A"/>
+                <w:sz w:val="22"/>
+                <w:szCs w:val="22"/>
+              </w:rPr>
+              <w:t xml:space="preserve">Type your answer here.</w:t>
+            </w:r>
+          </w:p>
+        </w:tc>
+      </w:tr>
+    </w:tbl>
+    <w:p>
+      <w:pPr>
+        <w:spacing w:after="160"/>
+      </w:pPr>
+      <w:r>
+        <w:t xml:space="preserve"/>
+      </w:r>
+    </w:p>
     <w:sectPr>
       <w:pgSz w:w="12240" w:h="15840" w:orient="portrait"/>
       <w:pgMar w:top="900" w:right="720" w:bottom="900" w:left="720" w:header="708" w:footer="708" w:gutter="0"/>

</xml_diff>